<commit_message>
replace with stanford-based fake resume content (Jordan Steele-Watson)
</commit_message>
<xml_diff>
--- a/FinalProducts/WordResume.docx
+++ b/FinalProducts/WordResume.docx
@@ -11,7 +11,7 @@
           <w:b/>
           <w:bCs/>
         </w:rPr>
-        <w:t xml:space="preserve">Alex Rivera-Santos</w:t>
+        <w:t xml:space="preserve">Jordan Steele-Watson</w:t>
       </w:r>
     </w:p>
     <w:p>
@@ -19,7 +19,7 @@
         <w:pStyle w:val="ResumeContact"/>
       </w:pPr>
       <w:r>
-        <w:t xml:space="preserve">(555) 342-7819 |</w:t>
+        <w:t xml:space="preserve">(555) 819-4237 |</w:t>
       </w:r>
       <w:r>
         <w:t xml:space="preserve"> </w:t>
@@ -29,7 +29,7 @@
           <w:rPr>
             <w:rStyle w:val="Hyperlink"/>
           </w:rPr>
-          <w:t xml:space="preserve">ariveras@northgate.edu</w:t>
+          <w:t xml:space="preserve">jordan.steelew@gmail.com</w:t>
         </w:r>
       </w:hyperlink>
       <w:r>
@@ -46,7 +46,7 @@
           <w:rPr>
             <w:rStyle w:val="Hyperlink"/>
           </w:rPr>
-          <w:t xml:space="preserve">linkedin.com/in/alex-rivera-santos</w:t>
+          <w:t xml:space="preserve">linkedin.com/in/jordan-steele-watson</w:t>
         </w:r>
       </w:hyperlink>
     </w:p>
@@ -59,6 +59,656 @@
       </w:pPr>
       <w:r>
         <w:t xml:space="preserve">EDUCATION</w:t>
+      </w:r>
+    </w:p>
+    <w:tbl>
+      <w:tblPr>
+        <w:tblStyle w:val="Table"/>
+        <w:tblW w:type="pct" w:w="10000"/>
+        <w:tblLook w:firstRow="1" w:lastRow="0" w:firstColumn="0" w:lastColumn="0" w:noHBand="0" w:noVBand="0" w:val="0020"/>
+        <w:tblLayout w:type="fixed"/>
+      </w:tblPr>
+      <w:tblGrid>
+        <w:gridCol w:w="8070"/>
+        <w:gridCol w:w="3000"/>
+      </w:tblGrid>
+      <w:tr>
+        <w:trPr>
+          <w:tblHeader w:val="on"/>
+        </w:trPr>
+        <w:tc>
+          <w:tcPr/>
+          <w:p>
+            <w:pPr>
+              <w:pStyle w:val="Heading2"/>
+              <w:ind w:left="0" w:hanging="0"/>
+            </w:pPr>
+            <w:r>
+              <w:rPr>
+                <w:b/>
+                <w:bCs/>
+              </w:rPr>
+              <w:t xml:space="preserve">Stanford University</w:t>
+            </w:r>
+          </w:p>
+        </w:tc>
+        <w:tc>
+          <w:tcPr/>
+          <w:p>
+            <w:pPr>
+              <w:pStyle w:val="Compact"/>
+              <w:jc w:val="right"/>
+            </w:pPr>
+            <w:r>
+              <w:t xml:space="preserve">Stanford, CA</w:t>
+              <w:rPr>
+                <w:b/>
+                <w:bCs/>
+              </w:rPr>
+            </w:r>
+          </w:p>
+        </w:tc>
+      </w:tr>
+      <w:tr>
+        <w:tc>
+          <w:tcPr/>
+          <w:p>
+            <w:pPr>
+              <w:pStyle w:val="Compact"/>
+            </w:pPr>
+            <w:r>
+              <w:rPr>
+                <w:i/>
+                <w:iCs/>
+              </w:rPr>
+              <w:t xml:space="preserve">School of Education</w:t>
+            </w:r>
+          </w:p>
+        </w:tc>
+        <w:tc>
+          <w:tcPr/>
+          <w:p>
+            <w:pPr>
+              <w:pStyle w:val="Compact"/>
+              <w:jc w:val="right"/>
+            </w:pPr>
+            <w:r>
+              <w:t xml:space="preserve">September 2019 – June 2021</w:t>
+              <w:rPr>
+                <w:b/>
+                <w:bCs/>
+              </w:rPr>
+            </w:r>
+          </w:p>
+        </w:tc>
+      </w:tr>
+      <w:tr>
+        <w:tc>
+          <w:tcPr/>
+          <w:p>
+            <w:pPr>
+              <w:pStyle w:val="Compact"/>
+            </w:pPr>
+            <w:r>
+              <w:rPr>
+                <w:i/>
+                <w:iCs/>
+              </w:rPr>
+              <w:t xml:space="preserve">Master of Arts, Student Affairs Administration and Policy</w:t>
+            </w:r>
+          </w:p>
+        </w:tc>
+        <w:tc>
+          <w:tcPr/>
+          <w:p>
+            <w:pPr>
+              <w:pStyle w:val="Compact"/>
+              <w:jc w:val="right"/>
+            </w:pPr>
+          </w:p>
+        </w:tc>
+      </w:tr>
+    </w:tbl>
+    <w:p>
+      <w:pPr>
+        <w:pStyle w:val="BodyText"/>
+      </w:pPr>
+      <w:r>
+        <w:t xml:space="preserve"> </w:t>
+      </w:r>
+    </w:p>
+    <w:tbl>
+      <w:tblPr>
+        <w:tblStyle w:val="Table"/>
+        <w:tblW w:type="pct" w:w="10000"/>
+        <w:tblLook w:firstRow="1" w:lastRow="0" w:firstColumn="0" w:lastColumn="0" w:noHBand="0" w:noVBand="0" w:val="0020"/>
+        <w:tblLayout w:type="fixed"/>
+      </w:tblPr>
+      <w:tblGrid>
+        <w:gridCol w:w="8070"/>
+        <w:gridCol w:w="3000"/>
+      </w:tblGrid>
+      <w:tr>
+        <w:trPr>
+          <w:tblHeader w:val="on"/>
+        </w:trPr>
+        <w:tc>
+          <w:tcPr/>
+          <w:p>
+            <w:pPr>
+              <w:pStyle w:val="Heading2"/>
+              <w:ind w:left="0" w:hanging="0"/>
+            </w:pPr>
+            <w:r>
+              <w:rPr>
+                <w:b/>
+                <w:bCs/>
+              </w:rPr>
+              <w:t xml:space="preserve">University of California, Davis</w:t>
+            </w:r>
+          </w:p>
+        </w:tc>
+        <w:tc>
+          <w:tcPr/>
+          <w:p>
+            <w:pPr>
+              <w:pStyle w:val="Compact"/>
+              <w:jc w:val="right"/>
+            </w:pPr>
+            <w:r>
+              <w:t xml:space="preserve">Davis, CA</w:t>
+              <w:rPr>
+                <w:b/>
+                <w:bCs/>
+              </w:rPr>
+            </w:r>
+          </w:p>
+        </w:tc>
+      </w:tr>
+      <w:tr>
+        <w:tc>
+          <w:tcPr/>
+          <w:p>
+            <w:pPr>
+              <w:pStyle w:val="Compact"/>
+            </w:pPr>
+            <w:r>
+              <w:rPr>
+                <w:i/>
+                <w:iCs/>
+              </w:rPr>
+              <w:t xml:space="preserve">College of Letters and Science</w:t>
+            </w:r>
+          </w:p>
+        </w:tc>
+        <w:tc>
+          <w:tcPr/>
+          <w:p>
+            <w:pPr>
+              <w:pStyle w:val="Compact"/>
+              <w:jc w:val="right"/>
+            </w:pPr>
+            <w:r>
+              <w:t xml:space="preserve">September 2015 – June 2019</w:t>
+              <w:rPr>
+                <w:b/>
+                <w:bCs/>
+              </w:rPr>
+            </w:r>
+          </w:p>
+        </w:tc>
+      </w:tr>
+      <w:tr>
+        <w:tc>
+          <w:tcPr/>
+          <w:p>
+            <w:pPr>
+              <w:pStyle w:val="Compact"/>
+            </w:pPr>
+            <w:r>
+              <w:rPr>
+                <w:i/>
+                <w:iCs/>
+              </w:rPr>
+              <w:t xml:space="preserve">Bachelor of Arts, Psychology; Minor in Sociology</w:t>
+            </w:r>
+          </w:p>
+        </w:tc>
+        <w:tc>
+          <w:tcPr/>
+          <w:p>
+            <w:pPr>
+              <w:pStyle w:val="Compact"/>
+              <w:jc w:val="right"/>
+            </w:pPr>
+          </w:p>
+        </w:tc>
+      </w:tr>
+    </w:tbl>
+    <w:bookmarkEnd w:id="22"/>
+    <w:bookmarkStart w:id="23" w:name="professional-experience"/>
+    <w:p>
+      <w:pPr>
+        <w:pStyle w:val="Heading1"/>
+        <w:ind w:left="0" w:hanging="0"/>
+        <w:spacing w:before="200" w:after="40" w:line="220" w:lineRule="auto"/>
+      </w:pPr>
+      <w:r>
+        <w:t xml:space="preserve">PROFESSIONAL EXPERIENCE</w:t>
+      </w:r>
+    </w:p>
+    <w:tbl>
+      <w:tblPr>
+        <w:tblStyle w:val="Table"/>
+        <w:tblW w:type="pct" w:w="10000"/>
+        <w:tblLook w:firstRow="1" w:lastRow="0" w:firstColumn="0" w:lastColumn="0" w:noHBand="0" w:noVBand="0" w:val="0020"/>
+        <w:tblLayout w:type="fixed"/>
+      </w:tblPr>
+      <w:tblGrid>
+        <w:gridCol w:w="8070"/>
+        <w:gridCol w:w="3000"/>
+      </w:tblGrid>
+      <w:tr>
+        <w:trPr>
+          <w:tblHeader w:val="on"/>
+        </w:trPr>
+        <w:tc>
+          <w:tcPr/>
+          <w:p>
+            <w:pPr>
+              <w:pStyle w:val="Heading2"/>
+              <w:ind w:left="0" w:hanging="0"/>
+            </w:pPr>
+            <w:r>
+              <w:rPr>
+                <w:b/>
+                <w:bCs/>
+              </w:rPr>
+              <w:t xml:space="preserve">Stanford University – Dean of Students Office</w:t>
+            </w:r>
+          </w:p>
+        </w:tc>
+        <w:tc>
+          <w:tcPr/>
+          <w:p>
+            <w:pPr>
+              <w:pStyle w:val="Compact"/>
+              <w:jc w:val="right"/>
+            </w:pPr>
+            <w:r>
+              <w:t xml:space="preserve">Stanford, CA</w:t>
+              <w:rPr>
+                <w:b/>
+                <w:bCs/>
+              </w:rPr>
+            </w:r>
+          </w:p>
+        </w:tc>
+      </w:tr>
+      <w:tr>
+        <w:tc>
+          <w:tcPr/>
+          <w:p>
+            <w:pPr>
+              <w:pStyle w:val="Compact"/>
+            </w:pPr>
+            <w:r>
+              <w:rPr>
+                <w:i/>
+                <w:iCs/>
+              </w:rPr>
+              <w:t xml:space="preserve">Student Success Advisor II</w:t>
+            </w:r>
+          </w:p>
+        </w:tc>
+        <w:tc>
+          <w:tcPr/>
+          <w:p>
+            <w:pPr>
+              <w:pStyle w:val="Compact"/>
+              <w:jc w:val="right"/>
+            </w:pPr>
+            <w:r>
+              <w:t xml:space="preserve">August 2023 – Present</w:t>
+              <w:rPr>
+                <w:b/>
+                <w:bCs/>
+              </w:rPr>
+            </w:r>
+          </w:p>
+        </w:tc>
+      </w:tr>
+    </w:tbl>
+    <w:p>
+      <w:pPr>
+        <w:pStyle w:val="Compact"/>
+        <w:numPr>
+          <w:ilvl w:val="0"/>
+          <w:numId w:val="1001"/>
+        </w:numPr>
+      </w:pPr>
+      <w:r>
+        <w:t xml:space="preserve">Advise undergraduate students in the School of Humanities and Sciences on academic planning, major declarations, and degree completion pathways across 50+ interdisciplinary majors</w:t>
+      </w:r>
+    </w:p>
+    <w:p>
+      <w:pPr>
+        <w:pStyle w:val="Compact"/>
+        <w:numPr>
+          <w:ilvl w:val="0"/>
+          <w:numId w:val="1001"/>
+        </w:numPr>
+      </w:pPr>
+      <w:r>
+        <w:t xml:space="preserve">Support students in the School of Earth, Energy &amp; Environmental Sciences with program requirements, research opportunities, and graduate school preparation</w:t>
+      </w:r>
+    </w:p>
+    <w:p>
+      <w:pPr>
+        <w:pStyle w:val="Compact"/>
+        <w:numPr>
+          <w:ilvl w:val="0"/>
+          <w:numId w:val="1001"/>
+        </w:numPr>
+      </w:pPr>
+      <w:r>
+        <w:t xml:space="preserve">Instruct</w:t>
+      </w:r>
+      <w:r>
+        <w:t xml:space="preserve"> </w:t>
+      </w:r>
+      <w:r>
+        <w:t xml:space="preserve">“COLLEGE 101,”</w:t>
+      </w:r>
+      <w:r>
+        <w:t xml:space="preserve"> </w:t>
+      </w:r>
+      <w:r>
+        <w:t xml:space="preserve">a first-year transition seminar providing incoming students with strategies for academic success, campus resource navigation, and community engagement</w:t>
+      </w:r>
+    </w:p>
+    <w:p>
+      <w:pPr>
+        <w:pStyle w:val="Compact"/>
+        <w:numPr>
+          <w:ilvl w:val="0"/>
+          <w:numId w:val="1001"/>
+        </w:numPr>
+      </w:pPr>
+      <w:r>
+        <w:t xml:space="preserve">Guide students through academic difficulty processes including leaves of absence, reinstatement petitions, and academic renewal, collaborating with the Office of Accessible Education as needed</w:t>
+      </w:r>
+    </w:p>
+    <w:p>
+      <w:pPr>
+        <w:pStyle w:val="Compact"/>
+        <w:numPr>
+          <w:ilvl w:val="0"/>
+          <w:numId w:val="1001"/>
+        </w:numPr>
+      </w:pPr>
+      <w:r>
+        <w:t xml:space="preserve">Develop individualized four-year graduation plans in alignment with university and program requirements, advising a caseload of 380 students</w:t>
+      </w:r>
+    </w:p>
+    <w:p>
+      <w:pPr>
+        <w:spacing w:before="0" w:after="0" w:line="276" w:lineRule="auto"/>
+      </w:pPr>
+      <w:r>
+        <w:t> </w:t>
+      </w:r>
+    </w:p>
+    <w:tbl>
+      <w:tblPr>
+        <w:tblStyle w:val="Table"/>
+        <w:tblW w:type="pct" w:w="10000"/>
+        <w:tblLook w:firstRow="1" w:lastRow="0" w:firstColumn="0" w:lastColumn="0" w:noHBand="0" w:noVBand="0" w:val="0020"/>
+        <w:tblLayout w:type="fixed"/>
+      </w:tblPr>
+      <w:tblGrid>
+        <w:gridCol w:w="8070"/>
+        <w:gridCol w:w="3000"/>
+      </w:tblGrid>
+      <w:tr>
+        <w:trPr>
+          <w:tblHeader w:val="on"/>
+        </w:trPr>
+        <w:tc>
+          <w:tcPr/>
+          <w:p>
+            <w:pPr>
+              <w:pStyle w:val="Heading2"/>
+              <w:ind w:left="0" w:hanging="0"/>
+            </w:pPr>
+            <w:r>
+              <w:rPr>
+                <w:b/>
+                <w:bCs/>
+              </w:rPr>
+              <w:t xml:space="preserve">Stanford University – Dean of Students Office</w:t>
+            </w:r>
+          </w:p>
+        </w:tc>
+        <w:tc>
+          <w:tcPr/>
+          <w:p>
+            <w:pPr>
+              <w:pStyle w:val="Compact"/>
+              <w:jc w:val="right"/>
+            </w:pPr>
+            <w:r>
+              <w:t xml:space="preserve">Stanford, CA</w:t>
+              <w:rPr>
+                <w:b/>
+                <w:bCs/>
+              </w:rPr>
+            </w:r>
+          </w:p>
+        </w:tc>
+      </w:tr>
+      <w:tr>
+        <w:tc>
+          <w:tcPr/>
+          <w:p>
+            <w:pPr>
+              <w:pStyle w:val="Compact"/>
+            </w:pPr>
+            <w:r>
+              <w:rPr>
+                <w:i/>
+                <w:iCs/>
+              </w:rPr>
+              <w:t xml:space="preserve">Student Success Advisor I</w:t>
+            </w:r>
+          </w:p>
+        </w:tc>
+        <w:tc>
+          <w:tcPr/>
+          <w:p>
+            <w:pPr>
+              <w:pStyle w:val="Compact"/>
+              <w:jc w:val="right"/>
+            </w:pPr>
+            <w:r>
+              <w:t xml:space="preserve">January 2022 – August 2023</w:t>
+              <w:rPr>
+                <w:b/>
+                <w:bCs/>
+              </w:rPr>
+            </w:r>
+          </w:p>
+        </w:tc>
+      </w:tr>
+    </w:tbl>
+    <w:p>
+      <w:pPr>
+        <w:pStyle w:val="Compact"/>
+        <w:numPr>
+          <w:ilvl w:val="0"/>
+          <w:numId w:val="1002"/>
+        </w:numPr>
+      </w:pPr>
+      <w:r>
+        <w:t xml:space="preserve">Advised first-generation and low-income undergraduate students across multiple schools on course selection, academic standing, and financial aid appeals through the FIRST program</w:t>
+      </w:r>
+    </w:p>
+    <w:p>
+      <w:pPr>
+        <w:pStyle w:val="Compact"/>
+        <w:numPr>
+          <w:ilvl w:val="0"/>
+          <w:numId w:val="1002"/>
+        </w:numPr>
+      </w:pPr>
+      <w:r>
+        <w:t xml:space="preserve">Managed a caseload of 310 students, building individualized academic plans and providing proactive outreach to students flagged through the early alert system</w:t>
+      </w:r>
+    </w:p>
+    <w:p>
+      <w:pPr>
+        <w:pStyle w:val="Compact"/>
+        <w:numPr>
+          <w:ilvl w:val="0"/>
+          <w:numId w:val="1002"/>
+        </w:numPr>
+      </w:pPr>
+      <w:r>
+        <w:t xml:space="preserve">Guided pre-health and pre-law students on prerequisite sequencing, standardized testing timelines, and professional school application requirements</w:t>
+      </w:r>
+    </w:p>
+    <w:p>
+      <w:pPr>
+        <w:pStyle w:val="Compact"/>
+        <w:numPr>
+          <w:ilvl w:val="0"/>
+          <w:numId w:val="1002"/>
+        </w:numPr>
+      </w:pPr>
+      <w:r>
+        <w:t xml:space="preserve">Facilitated transfer student orientation programming and served as a primary point of contact for incoming transfer students during their first academic year</w:t>
+      </w:r>
+    </w:p>
+    <w:p>
+      <w:pPr>
+        <w:spacing w:before="0" w:after="0" w:line="276" w:lineRule="auto"/>
+      </w:pPr>
+      <w:r>
+        <w:t> </w:t>
+      </w:r>
+    </w:p>
+    <w:tbl>
+      <w:tblPr>
+        <w:tblStyle w:val="Table"/>
+        <w:tblW w:type="pct" w:w="10000"/>
+        <w:tblLook w:firstRow="1" w:lastRow="0" w:firstColumn="0" w:lastColumn="0" w:noHBand="0" w:noVBand="0" w:val="0020"/>
+        <w:tblLayout w:type="fixed"/>
+      </w:tblPr>
+      <w:tblGrid>
+        <w:gridCol w:w="8070"/>
+        <w:gridCol w:w="3000"/>
+      </w:tblGrid>
+      <w:tr>
+        <w:trPr>
+          <w:tblHeader w:val="on"/>
+        </w:trPr>
+        <w:tc>
+          <w:tcPr/>
+          <w:p>
+            <w:pPr>
+              <w:pStyle w:val="Heading2"/>
+              <w:ind w:left="0" w:hanging="0"/>
+            </w:pPr>
+            <w:r>
+              <w:rPr>
+                <w:b/>
+                <w:bCs/>
+              </w:rPr>
+              <w:t xml:space="preserve">Private Academic Tutor</w:t>
+            </w:r>
+          </w:p>
+        </w:tc>
+        <w:tc>
+          <w:tcPr/>
+          <w:p>
+            <w:pPr>
+              <w:pStyle w:val="Compact"/>
+              <w:jc w:val="right"/>
+            </w:pPr>
+            <w:r>
+              <w:t xml:space="preserve">Palo Alto, CA</w:t>
+              <w:rPr>
+                <w:b/>
+                <w:bCs/>
+              </w:rPr>
+            </w:r>
+          </w:p>
+        </w:tc>
+      </w:tr>
+      <w:tr>
+        <w:tc>
+          <w:tcPr/>
+          <w:p>
+            <w:pPr>
+              <w:pStyle w:val="Compact"/>
+            </w:pPr>
+            <w:r>
+              <w:rPr>
+                <w:i/>
+                <w:iCs/>
+              </w:rPr>
+              <w:t xml:space="preserve">SAT/ACT and College Counselor</w:t>
+            </w:r>
+          </w:p>
+        </w:tc>
+        <w:tc>
+          <w:tcPr/>
+          <w:p>
+            <w:pPr>
+              <w:pStyle w:val="Compact"/>
+              <w:jc w:val="right"/>
+            </w:pPr>
+            <w:r>
+              <w:t xml:space="preserve">September 2021 – December 2023</w:t>
+              <w:rPr>
+                <w:b/>
+                <w:bCs/>
+              </w:rPr>
+            </w:r>
+          </w:p>
+        </w:tc>
+      </w:tr>
+    </w:tbl>
+    <w:p>
+      <w:pPr>
+        <w:pStyle w:val="Compact"/>
+        <w:numPr>
+          <w:ilvl w:val="0"/>
+          <w:numId w:val="1003"/>
+        </w:numPr>
+      </w:pPr>
+      <w:r>
+        <w:t xml:space="preserve">Delivered individualized instruction in Reading, Writing, and Mathematics to high school students preparing for standardized college admissions exams</w:t>
+      </w:r>
+    </w:p>
+    <w:p>
+      <w:pPr>
+        <w:pStyle w:val="Compact"/>
+        <w:numPr>
+          <w:ilvl w:val="0"/>
+          <w:numId w:val="1003"/>
+        </w:numPr>
+      </w:pPr>
+      <w:r>
+        <w:t xml:space="preserve">Supported students through the college application process, providing feedback on personal essays and guidance on school selection and financial aid strategy</w:t>
+      </w:r>
+    </w:p>
+    <w:p>
+      <w:pPr>
+        <w:spacing w:before="0" w:after="0" w:line="276" w:lineRule="auto"/>
+      </w:pPr>
+      <w:r>
+        <w:t> </w:t>
       </w:r>
     </w:p>
     <w:tbl>
@@ -88,7 +738,7 @@
                 <w:b/>
                 <w:bCs/>
               </w:rPr>
-              <w:t xml:space="preserve">Northgate University of Technology</w:t>
+              <w:t xml:space="preserve">Hillside Charter School</w:t>
             </w:r>
           </w:p>
         </w:tc>
@@ -100,7 +750,7 @@
               <w:jc w:val="right"/>
             </w:pPr>
             <w:r>
-              <w:t xml:space="preserve">Millbrook, OH</w:t>
+              <w:t xml:space="preserve">Oakland, CA</w:t>
               <w:rPr>
                 <w:b/>
                 <w:bCs/>
@@ -121,7 +771,7 @@
                 <w:i/>
                 <w:iCs/>
               </w:rPr>
-              <w:t xml:space="preserve">Department of Electrical Engineering and Computer Science</w:t>
+              <w:t xml:space="preserve">10th Grade English Language Arts Teacher</w:t>
             </w:r>
           </w:p>
         </w:tc>
@@ -133,7 +783,7 @@
               <w:jc w:val="right"/>
             </w:pPr>
             <w:r>
-              <w:t xml:space="preserve">August 2021 – Present</w:t>
+              <w:t xml:space="preserve">August 2021 – June 2023</w:t>
               <w:rPr>
                 <w:b/>
                 <w:bCs/>
@@ -154,7 +804,7 @@
                 <w:i/>
                 <w:iCs/>
               </w:rPr>
-              <w:t xml:space="preserve">Doctor of Philosophy in Machine Learning</w:t>
+              <w:t xml:space="preserve">11th Grade Student Teacher</w:t>
             </w:r>
           </w:p>
         </w:tc>
@@ -165,16 +815,71 @@
               <w:pStyle w:val="Compact"/>
               <w:jc w:val="right"/>
             </w:pPr>
+            <w:r>
+              <w:t xml:space="preserve">January 2021 – May 2021</w:t>
+              <w:rPr>
+                <w:b/>
+                <w:bCs/>
+              </w:rPr>
+            </w:r>
           </w:p>
         </w:tc>
       </w:tr>
     </w:tbl>
     <w:p>
       <w:pPr>
-        <w:pStyle w:val="BodyText"/>
-      </w:pPr>
-      <w:r>
-        <w:t xml:space="preserve"> </w:t>
+        <w:pStyle w:val="Compact"/>
+        <w:numPr>
+          <w:ilvl w:val="0"/>
+          <w:numId w:val="1004"/>
+        </w:numPr>
+      </w:pPr>
+      <w:r>
+        <w:t xml:space="preserve">Achieved highest year-over-year reading growth in the 10th grade cohort on district-wide literacy assessments; 71% of students met or exceeded grade-level benchmarks, exceeding the school average of 58%</w:t>
+      </w:r>
+    </w:p>
+    <w:p>
+      <w:pPr>
+        <w:pStyle w:val="Compact"/>
+        <w:numPr>
+          <w:ilvl w:val="0"/>
+          <w:numId w:val="1004"/>
+        </w:numPr>
+      </w:pPr>
+      <w:r>
+        <w:t xml:space="preserve">Designed standards-aligned units integrating social justice literature, student-produced journalism, and Socratic seminar to strengthen critical thinking and academic writing</w:t>
+      </w:r>
+    </w:p>
+    <w:p>
+      <w:pPr>
+        <w:pStyle w:val="Compact"/>
+        <w:numPr>
+          <w:ilvl w:val="0"/>
+          <w:numId w:val="1004"/>
+        </w:numPr>
+      </w:pPr>
+      <w:r>
+        <w:t xml:space="preserve">Analyzed formative assessment data weekly to drive differentiated small-group instruction and implement targeted reading intervention for below-grade-level learners</w:t>
+      </w:r>
+    </w:p>
+    <w:p>
+      <w:pPr>
+        <w:pStyle w:val="Compact"/>
+        <w:numPr>
+          <w:ilvl w:val="0"/>
+          <w:numId w:val="1004"/>
+        </w:numPr>
+      </w:pPr>
+      <w:r>
+        <w:t xml:space="preserve">Built strong family partnerships through biweekly progress updates and structured parent-teacher conferences, increasing family engagement by 34% over two years</w:t>
+      </w:r>
+    </w:p>
+    <w:p>
+      <w:pPr>
+        <w:spacing w:before="0" w:after="0" w:line="276" w:lineRule="auto"/>
+      </w:pPr>
+      <w:r>
+        <w:t> </w:t>
       </w:r>
     </w:p>
     <w:tbl>
@@ -204,7 +909,7 @@
                 <w:b/>
                 <w:bCs/>
               </w:rPr>
-              <w:t xml:space="preserve">Clearwater State University</w:t>
+              <w:t xml:space="preserve">UNHCR Kenya – Kakuma Refugee Camp</w:t>
             </w:r>
           </w:p>
         </w:tc>
@@ -216,7 +921,7 @@
               <w:jc w:val="right"/>
             </w:pPr>
             <w:r>
-              <w:t xml:space="preserve">Clearwater, TX</w:t>
+              <w:t xml:space="preserve">Nairobi, Kenya</w:t>
               <w:rPr>
                 <w:b/>
                 <w:bCs/>
@@ -237,7 +942,7 @@
                 <w:i/>
                 <w:iCs/>
               </w:rPr>
-              <w:t xml:space="preserve">College of Engineering</w:t>
+              <w:t xml:space="preserve">Education Program Intern</w:t>
             </w:r>
           </w:p>
         </w:tc>
@@ -249,7 +954,7 @@
               <w:jc w:val="right"/>
             </w:pPr>
             <w:r>
-              <w:t xml:space="preserve">August 2017 – May 2021</w:t>
+              <w:t xml:space="preserve">June 2018 – August 2018</w:t>
               <w:rPr>
                 <w:b/>
                 <w:bCs/>
@@ -258,6 +963,99 @@
           </w:p>
         </w:tc>
       </w:tr>
+    </w:tbl>
+    <w:p>
+      <w:pPr>
+        <w:pStyle w:val="Compact"/>
+        <w:numPr>
+          <w:ilvl w:val="0"/>
+          <w:numId w:val="1005"/>
+        </w:numPr>
+      </w:pPr>
+      <w:r>
+        <w:t xml:space="preserve">Designed and delivered differentiated English and numeracy curricula for refugee learners ages 10–35 across five proficiency levels, using project-based learning, storytelling, and peer tutoring models</w:t>
+      </w:r>
+    </w:p>
+    <w:p>
+      <w:pPr>
+        <w:pStyle w:val="Compact"/>
+        <w:numPr>
+          <w:ilvl w:val="0"/>
+          <w:numId w:val="1005"/>
+        </w:numPr>
+      </w:pPr>
+      <w:r>
+        <w:t xml:space="preserve">Taught life skills and civic education to secondary students following Kenya’s national curriculum framework within the camp’s accredited primary schools</w:t>
+      </w:r>
+    </w:p>
+    <w:p>
+      <w:pPr>
+        <w:pStyle w:val="Compact"/>
+        <w:numPr>
+          <w:ilvl w:val="0"/>
+          <w:numId w:val="1005"/>
+        </w:numPr>
+      </w:pPr>
+      <w:r>
+        <w:t xml:space="preserve">Applied trauma-informed and culturally responsive instructional practices to support student engagement and psychological safety in a humanitarian learning environment</w:t>
+      </w:r>
+    </w:p>
+    <w:p>
+      <w:pPr>
+        <w:spacing w:before="0" w:after="0" w:line="276" w:lineRule="auto"/>
+      </w:pPr>
+      <w:r>
+        <w:t> </w:t>
+      </w:r>
+    </w:p>
+    <w:tbl>
+      <w:tblPr>
+        <w:tblStyle w:val="Table"/>
+        <w:tblW w:type="pct" w:w="10000"/>
+        <w:tblLook w:firstRow="1" w:lastRow="0" w:firstColumn="0" w:lastColumn="0" w:noHBand="0" w:noVBand="0" w:val="0020"/>
+        <w:tblLayout w:type="fixed"/>
+      </w:tblPr>
+      <w:tblGrid>
+        <w:gridCol w:w="8070"/>
+        <w:gridCol w:w="3000"/>
+      </w:tblGrid>
+      <w:tr>
+        <w:trPr>
+          <w:tblHeader w:val="on"/>
+        </w:trPr>
+        <w:tc>
+          <w:tcPr/>
+          <w:p>
+            <w:pPr>
+              <w:pStyle w:val="Heading2"/>
+              <w:ind w:left="0" w:hanging="0"/>
+            </w:pPr>
+            <w:r>
+              <w:rPr>
+                <w:b/>
+                <w:bCs/>
+              </w:rPr>
+              <w:t xml:space="preserve">Pathways to College – UC Davis</w:t>
+            </w:r>
+          </w:p>
+        </w:tc>
+        <w:tc>
+          <w:tcPr/>
+          <w:p>
+            <w:pPr>
+              <w:pStyle w:val="Compact"/>
+              <w:jc w:val="right"/>
+            </w:pPr>
+            <w:r>
+              <w:t xml:space="preserve">Davis, CA</w:t>
+              <w:rPr>
+                <w:b/>
+                <w:bCs/>
+              </w:rPr>
+            </w:r>
+          </w:p>
+        </w:tc>
+      </w:tr>
       <w:tr>
         <w:tc>
           <w:tcPr/>
@@ -270,7 +1068,7 @@
                 <w:i/>
                 <w:iCs/>
               </w:rPr>
-              <w:t xml:space="preserve">Bachelor of Science, Computer Engineering, Summa Cum Laude</w:t>
+              <w:t xml:space="preserve">Vice President and Peer Mentor</w:t>
             </w:r>
           </w:p>
         </w:tc>
@@ -281,12 +1079,67 @@
               <w:pStyle w:val="Compact"/>
               <w:jc w:val="right"/>
             </w:pPr>
+            <w:r>
+              <w:t xml:space="preserve">September 2015 – June 2019</w:t>
+              <w:rPr>
+                <w:b/>
+                <w:bCs/>
+              </w:rPr>
+            </w:r>
           </w:p>
         </w:tc>
       </w:tr>
     </w:tbl>
-    <w:bookmarkEnd w:id="22"/>
-    <w:bookmarkStart w:id="23" w:name="professional-experience"/>
+    <w:p>
+      <w:pPr>
+        <w:pStyle w:val="Compact"/>
+        <w:numPr>
+          <w:ilvl w:val="0"/>
+          <w:numId w:val="1006"/>
+        </w:numPr>
+      </w:pPr>
+      <w:r>
+        <w:t xml:space="preserve">Led mentorship initiatives serving under-resourced high schools in the Sacramento Valley, coordinating a network of 40 volunteer mentors and 120 high school mentees</w:t>
+      </w:r>
+    </w:p>
+    <w:p>
+      <w:pPr>
+        <w:pStyle w:val="Compact"/>
+        <w:numPr>
+          <w:ilvl w:val="0"/>
+          <w:numId w:val="1006"/>
+        </w:numPr>
+      </w:pPr>
+      <w:r>
+        <w:t xml:space="preserve">Designed and facilitated workshops for seniors on college application strategy, including personal statement writing, FAFSA completion, scholarship identification, and financial aid appeals</w:t>
+      </w:r>
+    </w:p>
+    <w:p>
+      <w:pPr>
+        <w:pStyle w:val="Compact"/>
+        <w:numPr>
+          <w:ilvl w:val="0"/>
+          <w:numId w:val="1006"/>
+        </w:numPr>
+      </w:pPr>
+      <w:r>
+        <w:t xml:space="preserve">Reviewed and provided structured feedback on personal statements and supplemental essays, supporting mentees in articulating their identities and goals to admissions committees</w:t>
+      </w:r>
+    </w:p>
+    <w:p>
+      <w:pPr>
+        <w:pStyle w:val="Compact"/>
+        <w:numPr>
+          <w:ilvl w:val="0"/>
+          <w:numId w:val="1006"/>
+        </w:numPr>
+      </w:pPr>
+      <w:r>
+        <w:t xml:space="preserve">Maintained yearlong one-on-one mentorship relationships, providing academic guidance and emotional support to first-generation college-going students throughout the application cycle</w:t>
+      </w:r>
+    </w:p>
+    <w:bookmarkEnd w:id="23"/>
+    <w:bookmarkStart w:id="24" w:name="leadership-and-community-service"/>
     <w:p>
       <w:pPr>
         <w:pStyle w:val="Heading1"/>
@@ -294,7 +1147,7 @@
         <w:spacing w:before="200" w:after="40" w:line="220" w:lineRule="auto"/>
       </w:pPr>
       <w:r>
-        <w:t xml:space="preserve">PROFESSIONAL EXPERIENCE</w:t>
+        <w:t xml:space="preserve">LEADERSHIP AND COMMUNITY SERVICE</w:t>
       </w:r>
     </w:p>
     <w:tbl>
@@ -324,7 +1177,7 @@
                 <w:b/>
                 <w:bCs/>
               </w:rPr>
-              <w:t xml:space="preserve">Northgate University of Technology – Adaptive Systems Lab</w:t>
+              <w:t xml:space="preserve">Bay Area Tutors Collective</w:t>
             </w:r>
           </w:p>
         </w:tc>
@@ -336,7 +1189,7 @@
               <w:jc w:val="right"/>
             </w:pPr>
             <w:r>
-              <w:t xml:space="preserve">Millbrook, OH</w:t>
+              <w:t xml:space="preserve">San Jose, CA</w:t>
               <w:rPr>
                 <w:b/>
                 <w:bCs/>
@@ -357,7 +1210,7 @@
                 <w:i/>
                 <w:iCs/>
               </w:rPr>
-              <w:t xml:space="preserve">Graduate Research Assistant</w:t>
+              <w:t xml:space="preserve">Youth Programs – Outreach Coordinator</w:t>
             </w:r>
           </w:p>
         </w:tc>
@@ -369,7 +1222,7 @@
               <w:jc w:val="right"/>
             </w:pPr>
             <w:r>
-              <w:t xml:space="preserve">August 2021 – Present</w:t>
+              <w:t xml:space="preserve">February 2023 – February 2024</w:t>
               <w:rPr>
                 <w:b/>
                 <w:bCs/>
@@ -384,11 +1237,11 @@
         <w:pStyle w:val="Compact"/>
         <w:numPr>
           <w:ilvl w:val="0"/>
-          <w:numId w:val="1001"/>
+          <w:numId w:val="1007"/>
         </w:numPr>
       </w:pPr>
       <w:r>
-        <w:t xml:space="preserve">Designed and implemented novel safe reinforcement learning algorithms for autonomous aerial vehicles</w:t>
+        <w:t xml:space="preserve">Conducted community outreach through school partnerships, library tabling, and social media campaigns to connect under-resourced students with free tutoring services across Santa Clara County</w:t>
       </w:r>
     </w:p>
     <w:p>
@@ -396,11 +1249,11 @@
         <w:pStyle w:val="Compact"/>
         <w:numPr>
           <w:ilvl w:val="0"/>
-          <w:numId w:val="1001"/>
+          <w:numId w:val="1007"/>
         </w:numPr>
       </w:pPr>
       <w:r>
-        <w:t xml:space="preserve">Deployed real-time control policies on embedded hardware platforms under strict computational constraints</w:t>
+        <w:t xml:space="preserve">Coordinated volunteer tutor recruitment, onboarding, and training, growing the active volunteer roster from 28 to 74 tutors over ten months</w:t>
       </w:r>
     </w:p>
     <w:p>
@@ -408,11 +1261,11 @@
         <w:pStyle w:val="Compact"/>
         <w:numPr>
           <w:ilvl w:val="0"/>
-          <w:numId w:val="1001"/>
+          <w:numId w:val="1007"/>
         </w:numPr>
       </w:pPr>
       <w:r>
-        <w:t xml:space="preserve">Published and presented research at top-tier conferences and journals in machine learning and robotics</w:t>
+        <w:t xml:space="preserve">Designed and facilitated a six-week college readiness workshop series for 11th and 12th graders, covering essay writing, financial aid literacy, and campus visit preparation</w:t>
       </w:r>
     </w:p>
     <w:p>
@@ -420,11 +1273,161 @@
         <w:pStyle w:val="Compact"/>
         <w:numPr>
           <w:ilvl w:val="0"/>
-          <w:numId w:val="1001"/>
+          <w:numId w:val="1007"/>
         </w:numPr>
       </w:pPr>
       <w:r>
-        <w:t xml:space="preserve">Advised by Dr. Priya Nair</w:t>
+        <w:t xml:space="preserve">Tracked program outcomes using attendance logs and pre/post surveys, reporting aggregate impact data to funders and board members on a quarterly basis</w:t>
+      </w:r>
+    </w:p>
+    <w:p>
+      <w:pPr>
+        <w:pStyle w:val="Compact"/>
+        <w:numPr>
+          <w:ilvl w:val="0"/>
+          <w:numId w:val="1007"/>
+        </w:numPr>
+      </w:pPr>
+      <w:r>
+        <w:t xml:space="preserve">Completed certification in restorative practices and applied restorative circles to resolve conflicts within the volunteer community</w:t>
+      </w:r>
+    </w:p>
+    <w:p>
+      <w:pPr>
+        <w:spacing w:before="0" w:after="0" w:line="276" w:lineRule="auto"/>
+      </w:pPr>
+      <w:r>
+        <w:t> </w:t>
+      </w:r>
+    </w:p>
+    <w:tbl>
+      <w:tblPr>
+        <w:tblStyle w:val="Table"/>
+        <w:tblW w:type="pct" w:w="10000"/>
+        <w:tblLook w:firstRow="1" w:lastRow="0" w:firstColumn="0" w:lastColumn="0" w:noHBand="0" w:noVBand="0" w:val="0020"/>
+        <w:tblLayout w:type="fixed"/>
+      </w:tblPr>
+      <w:tblGrid>
+        <w:gridCol w:w="8070"/>
+        <w:gridCol w:w="3000"/>
+      </w:tblGrid>
+      <w:tr>
+        <w:trPr>
+          <w:tblHeader w:val="on"/>
+        </w:trPr>
+        <w:tc>
+          <w:tcPr/>
+          <w:p>
+            <w:pPr>
+              <w:pStyle w:val="Heading2"/>
+              <w:ind w:left="0" w:hanging="0"/>
+            </w:pPr>
+            <w:r>
+              <w:rPr>
+                <w:b/>
+                <w:bCs/>
+              </w:rPr>
+              <w:t xml:space="preserve">Filipino Student Union – Hillside Charter School</w:t>
+            </w:r>
+          </w:p>
+        </w:tc>
+        <w:tc>
+          <w:tcPr/>
+          <w:p>
+            <w:pPr>
+              <w:pStyle w:val="Compact"/>
+              <w:jc w:val="right"/>
+            </w:pPr>
+            <w:r>
+              <w:t xml:space="preserve">Oakland, CA</w:t>
+              <w:rPr>
+                <w:b/>
+                <w:bCs/>
+              </w:rPr>
+            </w:r>
+          </w:p>
+        </w:tc>
+      </w:tr>
+      <w:tr>
+        <w:tc>
+          <w:tcPr/>
+          <w:p>
+            <w:pPr>
+              <w:pStyle w:val="Compact"/>
+            </w:pPr>
+            <w:r>
+              <w:rPr>
+                <w:i/>
+                <w:iCs/>
+              </w:rPr>
+              <w:t xml:space="preserve">Faculty Advisor</w:t>
+            </w:r>
+          </w:p>
+        </w:tc>
+        <w:tc>
+          <w:tcPr/>
+          <w:p>
+            <w:pPr>
+              <w:pStyle w:val="Compact"/>
+              <w:jc w:val="right"/>
+            </w:pPr>
+            <w:r>
+              <w:t xml:space="preserve">September 2021 – June 2023</w:t>
+              <w:rPr>
+                <w:b/>
+                <w:bCs/>
+              </w:rPr>
+            </w:r>
+          </w:p>
+        </w:tc>
+      </w:tr>
+    </w:tbl>
+    <w:p>
+      <w:pPr>
+        <w:pStyle w:val="Compact"/>
+        <w:numPr>
+          <w:ilvl w:val="0"/>
+          <w:numId w:val="1008"/>
+        </w:numPr>
+      </w:pPr>
+      <w:r>
+        <w:t xml:space="preserve">Facilitated biweekly after-school meetings centered on Filipino and Filipino-American history, cultural identity, and community advocacy</w:t>
+      </w:r>
+    </w:p>
+    <w:p>
+      <w:pPr>
+        <w:pStyle w:val="Compact"/>
+        <w:numPr>
+          <w:ilvl w:val="0"/>
+          <w:numId w:val="1008"/>
+        </w:numPr>
+      </w:pPr>
+      <w:r>
+        <w:t xml:space="preserve">Organized monthly themed programming spotlighting regional traditions, indigenous languages, and contemporary issues in the Filipino diaspora</w:t>
+      </w:r>
+    </w:p>
+    <w:p>
+      <w:pPr>
+        <w:pStyle w:val="Compact"/>
+        <w:numPr>
+          <w:ilvl w:val="0"/>
+          <w:numId w:val="1008"/>
+        </w:numPr>
+      </w:pPr>
+      <w:r>
+        <w:t xml:space="preserve">Led cross-cultural dialogue sessions in collaboration with the school’s Ethnic Studies department to broaden student understanding of shared struggles and intersecting identities</w:t>
+      </w:r>
+    </w:p>
+    <w:p>
+      <w:pPr>
+        <w:pStyle w:val="Compact"/>
+        <w:numPr>
+          <w:ilvl w:val="0"/>
+          <w:numId w:val="1008"/>
+        </w:numPr>
+      </w:pPr>
+      <w:r>
+        <w:t xml:space="preserve">Created a safe and affirming space for students navigating questions of cultural belonging, code-switching, and representation in predominantly non-Filipino academic environments</w:t>
       </w:r>
     </w:p>
     <w:p>
@@ -462,7 +1465,7 @@
                 <w:b/>
                 <w:bCs/>
               </w:rPr>
-              <w:t xml:space="preserve">Northgate University of Technology</w:t>
+              <w:t xml:space="preserve">AmeriCorps – California Volunteers</w:t>
             </w:r>
           </w:p>
         </w:tc>
@@ -474,7 +1477,7 @@
               <w:jc w:val="right"/>
             </w:pPr>
             <w:r>
-              <w:t xml:space="preserve">Millbrook, OH</w:t>
+              <w:t xml:space="preserve">Stockton, CA</w:t>
               <w:rPr>
                 <w:b/>
                 <w:bCs/>
@@ -495,7 +1498,7 @@
                 <w:i/>
                 <w:iCs/>
               </w:rPr>
-              <w:t xml:space="preserve">Teaching Assistant, Foundations of Machine Learning</w:t>
+              <w:t xml:space="preserve">Education and Workforce Readiness Intern</w:t>
             </w:r>
           </w:p>
         </w:tc>
@@ -507,7 +1510,7 @@
               <w:jc w:val="right"/>
             </w:pPr>
             <w:r>
-              <w:t xml:space="preserve">January 2022 – May 2023</w:t>
+              <w:t xml:space="preserve">January 2020 – August 2020</w:t>
               <w:rPr>
                 <w:b/>
                 <w:bCs/>
@@ -522,11 +1525,11 @@
         <w:pStyle w:val="Compact"/>
         <w:numPr>
           <w:ilvl w:val="0"/>
-          <w:numId w:val="1002"/>
+          <w:numId w:val="1009"/>
         </w:numPr>
       </w:pPr>
       <w:r>
-        <w:t xml:space="preserve">Assisted professor with course instruction for a cohort of 120 graduate students</w:t>
+        <w:t xml:space="preserve">Supported economic mobility programming for recently displaced workers by co-facilitating job readiness workshops covering resume writing, interview skills, and digital literacy</w:t>
       </w:r>
     </w:p>
     <w:p>
@@ -534,11 +1537,11 @@
         <w:pStyle w:val="Compact"/>
         <w:numPr>
           <w:ilvl w:val="0"/>
-          <w:numId w:val="1002"/>
+          <w:numId w:val="1009"/>
         </w:numPr>
       </w:pPr>
       <w:r>
-        <w:t xml:space="preserve">Hosted weekly office hours and review sessions in preparation for exams and assignments</w:t>
+        <w:t xml:space="preserve">Partnered with community college advisors to connect participants to retraining programs, GED pathways, and occupational certificate courses aligned with regional employer demand</w:t>
       </w:r>
     </w:p>
     <w:p>
@@ -546,11 +1549,35 @@
         <w:pStyle w:val="Compact"/>
         <w:numPr>
           <w:ilvl w:val="0"/>
-          <w:numId w:val="1002"/>
+          <w:numId w:val="1009"/>
         </w:numPr>
       </w:pPr>
       <w:r>
-        <w:t xml:space="preserve">Graded homeworks, exams, and programming projects covering supervised and unsupervised learning</w:t>
+        <w:t xml:space="preserve">Developed plain-language educational materials for workshop handouts, resource guides, and social media outreach targeting low-literacy and non-English-speaking community members</w:t>
+      </w:r>
+    </w:p>
+    <w:p>
+      <w:pPr>
+        <w:pStyle w:val="Compact"/>
+        <w:numPr>
+          <w:ilvl w:val="0"/>
+          <w:numId w:val="1009"/>
+        </w:numPr>
+      </w:pPr>
+      <w:r>
+        <w:t xml:space="preserve">Designed and delivered an eight-session financial literacy curriculum for adults covering budgeting, credit building, and benefits enrollment</w:t>
+      </w:r>
+    </w:p>
+    <w:p>
+      <w:pPr>
+        <w:pStyle w:val="Compact"/>
+        <w:numPr>
+          <w:ilvl w:val="0"/>
+          <w:numId w:val="1009"/>
+        </w:numPr>
+      </w:pPr>
+      <w:r>
+        <w:t xml:space="preserve">Maintained participant case files and service logs in Salesforce, contributing to grant compliance reporting and quarterly outcome summaries</w:t>
       </w:r>
     </w:p>
     <w:p>
@@ -565,8 +1592,8 @@
       <w:tblPr>
         <w:tblStyle w:val="Table"/>
         <w:tblW w:type="pct" w:w="10000"/>
+        <w:tblLook w:firstRow="1" w:lastRow="0" w:firstColumn="0" w:lastColumn="0" w:noHBand="0" w:noVBand="0" w:val="0020"/>
         <w:tblLayout w:type="fixed"/>
-        <w:tblLook w:firstRow="1" w:lastRow="0" w:firstColumn="0" w:lastColumn="0" w:noHBand="0" w:noVBand="0" w:val="0020"/>
       </w:tblPr>
       <w:tblGrid>
         <w:gridCol w:w="8070"/>
@@ -588,7 +1615,7 @@
                 <w:b/>
                 <w:bCs/>
               </w:rPr>
-              <w:t xml:space="preserve">Clearwater State University – Embedded Systems Lab</w:t>
+              <w:t xml:space="preserve">Rising Scholars Summer Institute</w:t>
             </w:r>
           </w:p>
         </w:tc>
@@ -600,7 +1627,7 @@
               <w:jc w:val="right"/>
             </w:pPr>
             <w:r>
-              <w:t xml:space="preserve">Clearwater, TX</w:t>
+              <w:t xml:space="preserve">Sacramento, CA</w:t>
               <w:rPr>
                 <w:b/>
                 <w:bCs/>
@@ -621,7 +1648,7 @@
                 <w:i/>
                 <w:iCs/>
               </w:rPr>
-              <w:t xml:space="preserve">Research Assistant</w:t>
+              <w:t xml:space="preserve">Program Content Manager</w:t>
             </w:r>
           </w:p>
         </w:tc>
@@ -633,7 +1660,7 @@
               <w:jc w:val="right"/>
             </w:pPr>
             <w:r>
-              <w:t xml:space="preserve">November 2019 – May 2021</w:t>
+              <w:t xml:space="preserve">January 2019 – May 2019</w:t>
               <w:rPr>
                 <w:b/>
                 <w:bCs/>
@@ -648,11 +1675,11 @@
         <w:pStyle w:val="Compact"/>
         <w:numPr>
           <w:ilvl w:val="0"/>
-          <w:numId w:val="1003"/>
+          <w:numId w:val="1010"/>
         </w:numPr>
       </w:pPr>
       <w:r>
-        <w:t xml:space="preserve">Developed low-level firmware for sensor fusion on constrained microcontroller platforms</w:t>
+        <w:t xml:space="preserve">Developed lesson plans, activity guides, and instructional materials for 120 students (ages 8–14) anchored in STEM, Creative Writing, and Civic Leadership themes</w:t>
       </w:r>
     </w:p>
     <w:p>
@@ -660,11 +1687,11 @@
         <w:pStyle w:val="Compact"/>
         <w:numPr>
           <w:ilvl w:val="0"/>
-          <w:numId w:val="1003"/>
+          <w:numId w:val="1010"/>
         </w:numPr>
       </w:pPr>
       <w:r>
-        <w:t xml:space="preserve">Contributed to original research on energy-efficient path planning for ground vehicles</w:t>
+        <w:t xml:space="preserve">Trained and supervised 52 camp counselors and activity leads in lesson delivery, youth development principles, and behavior management strategies</w:t>
       </w:r>
     </w:p>
     <w:p>
@@ -672,141 +1699,11 @@
         <w:pStyle w:val="Compact"/>
         <w:numPr>
           <w:ilvl w:val="0"/>
-          <w:numId w:val="1003"/>
+          <w:numId w:val="1010"/>
         </w:numPr>
       </w:pPr>
       <w:r>
-        <w:t xml:space="preserve">Advised by Dr. Marcus Delgado</w:t>
-      </w:r>
-    </w:p>
-    <w:bookmarkEnd w:id="23"/>
-    <w:bookmarkStart w:id="24" w:name="leadership-and-service"/>
-    <w:p>
-      <w:pPr>
-        <w:pStyle w:val="Heading1"/>
-        <w:ind w:left="0" w:hanging="0"/>
-        <w:spacing w:before="200" w:after="40" w:line="220" w:lineRule="auto"/>
-      </w:pPr>
-      <w:r>
-        <w:t xml:space="preserve">LEADERSHIP AND SERVICE</w:t>
-      </w:r>
-    </w:p>
-    <w:tbl>
-      <w:tblPr>
-        <w:tblStyle w:val="Table"/>
-        <w:tblW w:type="pct" w:w="10000"/>
-        <w:tblLayout w:type="fixed"/>
-        <w:tblLook w:firstRow="1" w:lastRow="0" w:firstColumn="0" w:lastColumn="0" w:noHBand="0" w:noVBand="0" w:val="0020"/>
-      </w:tblPr>
-      <w:tblGrid>
-        <w:gridCol w:w="8070"/>
-        <w:gridCol w:w="3000"/>
-      </w:tblGrid>
-      <w:tr>
-        <w:trPr>
-          <w:tblHeader w:val="on"/>
-        </w:trPr>
-        <w:tc>
-          <w:tcPr/>
-          <w:p>
-            <w:pPr>
-              <w:pStyle w:val="Heading2"/>
-              <w:ind w:left="0" w:hanging="0"/>
-            </w:pPr>
-            <w:r>
-              <w:rPr>
-                <w:b/>
-                <w:bCs/>
-              </w:rPr>
-              <w:t xml:space="preserve">Latin American Engineering Society – Northgate University of Technology</w:t>
-            </w:r>
-          </w:p>
-        </w:tc>
-        <w:tc>
-          <w:tcPr/>
-          <w:p>
-            <w:pPr>
-              <w:pStyle w:val="Compact"/>
-              <w:jc w:val="right"/>
-            </w:pPr>
-            <w:r>
-              <w:t xml:space="preserve">Millbrook, OH</w:t>
-              <w:rPr>
-                <w:b/>
-                <w:bCs/>
-              </w:rPr>
-            </w:r>
-          </w:p>
-        </w:tc>
-      </w:tr>
-      <w:tr>
-        <w:tc>
-          <w:tcPr/>
-          <w:p>
-            <w:pPr>
-              <w:pStyle w:val="Compact"/>
-            </w:pPr>
-            <w:r>
-              <w:rPr>
-                <w:i/>
-                <w:iCs/>
-              </w:rPr>
-              <w:t xml:space="preserve">Co-Founder and President</w:t>
-            </w:r>
-          </w:p>
-        </w:tc>
-        <w:tc>
-          <w:tcPr/>
-          <w:p>
-            <w:pPr>
-              <w:pStyle w:val="Compact"/>
-              <w:jc w:val="right"/>
-            </w:pPr>
-            <w:r>
-              <w:t xml:space="preserve">September 2022 – Present</w:t>
-              <w:rPr>
-                <w:b/>
-                <w:bCs/>
-              </w:rPr>
-            </w:r>
-          </w:p>
-        </w:tc>
-      </w:tr>
-    </w:tbl>
-    <w:p>
-      <w:pPr>
-        <w:pStyle w:val="Compact"/>
-        <w:numPr>
-          <w:ilvl w:val="0"/>
-          <w:numId w:val="1004"/>
-        </w:numPr>
-      </w:pPr>
-      <w:r>
-        <w:t xml:space="preserve">Assembled a four-member founding board and secured a faculty advisor and university departmental sponsorship</w:t>
-      </w:r>
-    </w:p>
-    <w:p>
-      <w:pPr>
-        <w:pStyle w:val="Compact"/>
-        <w:numPr>
-          <w:ilvl w:val="0"/>
-          <w:numId w:val="1004"/>
-        </w:numPr>
-      </w:pPr>
-      <w:r>
-        <w:t xml:space="preserve">Raised operating funds and recruited members from across the College of Engineering</w:t>
-      </w:r>
-    </w:p>
-    <w:p>
-      <w:pPr>
-        <w:pStyle w:val="Compact"/>
-        <w:numPr>
-          <w:ilvl w:val="0"/>
-          <w:numId w:val="1004"/>
-        </w:numPr>
-      </w:pPr>
-      <w:r>
-        <w:t xml:space="preserve">Organized professional development workshops, cultural events, and networking sessions with industry partners</w:t>
+        <w:t xml:space="preserve">Managed the program curriculum budget, sourcing cost-effective supplies and partnering with local businesses to secure in-kind donations of materials</w:t>
       </w:r>
     </w:p>
     <w:bookmarkEnd w:id="24"/>
@@ -2166,6 +3063,24 @@
     <w:abstractNumId w:val="991"/>
   </w:num>
   <w:num w:numId="1004">
+    <w:abstractNumId w:val="991"/>
+  </w:num>
+  <w:num w:numId="1005">
+    <w:abstractNumId w:val="991"/>
+  </w:num>
+  <w:num w:numId="1006">
+    <w:abstractNumId w:val="991"/>
+  </w:num>
+  <w:num w:numId="1007">
+    <w:abstractNumId w:val="991"/>
+  </w:num>
+  <w:num w:numId="1008">
+    <w:abstractNumId w:val="991"/>
+  </w:num>
+  <w:num w:numId="1009">
+    <w:abstractNumId w:val="991"/>
+  </w:num>
+  <w:num w:numId="1010">
     <w:abstractNumId w:val="991"/>
   </w:num>
 </w:numbering>

</xml_diff>